<commit_message>
Now reading the pdf and renaming it
</commit_message>
<xml_diff>
--- a/main/Data/Output/Raport_Barcelona.docx
+++ b/main/Data/Output/Raport_Barcelona.docx
@@ -15,63 +15,7 @@
     </w:p>
     <w:p>
       <w:r>
-        <w:t>Raport Cazare pentru Barcelona</w:t>
-      </w:r>
-    </w:p>
-    <w:p>
-      <w:r>
-        <w:t>Robotul a identificat un număr total de 0 oferte disponibile.</w:t>
-      </w:r>
-    </w:p>
-    <w:p>
-      <w:r>
-        <w:t>Raport Cazare pentru Barcelona</w:t>
-      </w:r>
-    </w:p>
-    <w:p>
-      <w:r>
-        <w:t>Robotul a identificat un număr total de 18 oferte disponibile.</w:t>
-      </w:r>
-    </w:p>
-    <w:p>
-      <w:r>
-        <w:t>Raport Cazare pentru Barcelona</w:t>
-      </w:r>
-    </w:p>
-    <w:p>
-      <w:r>
-        <w:t>Robotul a identificat un număr total de 18 oferte disponibile.</w:t>
-      </w:r>
-    </w:p>
-    <w:p>
-      <w:r>
         <w:t>Mai jos sunt cateva din cazarile gasite de noi:</w:t>
-      </w:r>
-    </w:p>
-    <w:p>
-      <w:r>
-        <w:t>1. https://www.airbnb.com.ro/rooms/1599341887296328393?adults=2&amp;check_in=2026-06-15&amp;check_out=2026-06-22&amp;search_mode=regular_search&amp;source_impression_id=p3_1768843059_P3JHPpVIUjkOtOgw&amp;previous_page_section_name=1000&amp;federated_search_id=5fceb267-22d0-481e-a8fd-edf81ab4c9f9</w:t>
-      </w:r>
-    </w:p>
-    <w:p>
-      <w:r>
-        <w:t>2. https://www.airbnb.com.ro/rooms/30254261?adults=2&amp;check_in=2026-06-15&amp;check_out=2026-06-22&amp;search_mode=regular_search&amp;source_impression_id=p3_1768843060_P37ko9OCqbUEusrp&amp;previous_page_section_name=1000&amp;federated_search_id=5fceb267-22d0-481e-a8fd-edf81ab4c9f9</w:t>
-      </w:r>
-    </w:p>
-    <w:p>
-      <w:r>
-        <w:t>3. https://www.airbnb.com.ro/rooms/1467063418251640368?adults=2&amp;check_in=2026-06-15&amp;check_out=2026-06-22&amp;search_mode=regular_search&amp;source_impression_id=p3_1768843060_P3tux4ueGMxgC9AU&amp;previous_page_section_name=1000&amp;federated_search_id=5fceb267-22d0-481e-a8fd-edf81ab4c9f9</w:t>
-      </w:r>
-    </w:p>
-    <w:p>
-      <w:r>
-        <w:t>4. https://www.airbnb.com.ro/rooms/1600085139415843311?adults=2&amp;check_in=2026-06-15&amp;check_out=2026-06-22&amp;search_mode=regular_search&amp;source_impression_id=p3_1768843060_P3v8d1kvfzFzzvtg&amp;previous_page_section_name=1000&amp;federated_search_id=5fceb267-22d0-481e-a8fd-edf81ab4c9f9</w:t>
-      </w:r>
-    </w:p>
-    <w:p>
-      <w:r>
-        <w:lastRenderedPageBreak/>
-        <w:t>5. https://www.airbnb.com.ro/rooms/1137755103464382050?adults=2&amp;check_in=2026-06-15&amp;check_out=2026-06-22&amp;search_mode=regular_search&amp;category_tag=Tag%3A8678&amp;photo_id=2415732136&amp;source_impression_id=p3_1768843060_P3BQBkrDwlHVnhGk&amp;previous_page_section_name=1000&amp;federated_search_id=5fceb267-22d0-481e-a8fd-edf81ab4c9f9</w:t>
       </w:r>
     </w:p>
     <w:sectPr>
@@ -492,7 +436,7 @@
     <w:link w:val="Heading1Char"/>
     <w:uiPriority w:val="9"/>
     <w:qFormat/>
-    <w:rsid w:val="00190F51"/>
+    <w:rsid w:val="008A3965"/>
     <w:pPr>
       <w:keepNext/>
       <w:keepLines/>
@@ -501,7 +445,7 @@
     </w:pPr>
     <w:rPr>
       <w:rFonts w:asciiTheme="majorHAnsi" w:eastAsiaTheme="majorEastAsia" w:hAnsiTheme="majorHAnsi" w:cstheme="majorBidi"/>
-      <w:color w:val="0F4761" w:themeColor="accent1" w:themeShade="BF"/>
+      <w:color w:val="2F5496" w:themeColor="accent1" w:themeShade="BF"/>
       <w:sz w:val="40"/>
       <w:szCs w:val="40"/>
     </w:rPr>
@@ -515,7 +459,7 @@
     <w:semiHidden/>
     <w:unhideWhenUsed/>
     <w:qFormat/>
-    <w:rsid w:val="00190F51"/>
+    <w:rsid w:val="008A3965"/>
     <w:pPr>
       <w:keepNext/>
       <w:keepLines/>
@@ -524,7 +468,7 @@
     </w:pPr>
     <w:rPr>
       <w:rFonts w:asciiTheme="majorHAnsi" w:eastAsiaTheme="majorEastAsia" w:hAnsiTheme="majorHAnsi" w:cstheme="majorBidi"/>
-      <w:color w:val="0F4761" w:themeColor="accent1" w:themeShade="BF"/>
+      <w:color w:val="2F5496" w:themeColor="accent1" w:themeShade="BF"/>
       <w:sz w:val="32"/>
       <w:szCs w:val="32"/>
     </w:rPr>
@@ -538,7 +482,7 @@
     <w:semiHidden/>
     <w:unhideWhenUsed/>
     <w:qFormat/>
-    <w:rsid w:val="00190F51"/>
+    <w:rsid w:val="008A3965"/>
     <w:pPr>
       <w:keepNext/>
       <w:keepLines/>
@@ -547,7 +491,7 @@
     </w:pPr>
     <w:rPr>
       <w:rFonts w:eastAsiaTheme="majorEastAsia" w:cstheme="majorBidi"/>
-      <w:color w:val="0F4761" w:themeColor="accent1" w:themeShade="BF"/>
+      <w:color w:val="2F5496" w:themeColor="accent1" w:themeShade="BF"/>
       <w:sz w:val="28"/>
       <w:szCs w:val="28"/>
     </w:rPr>
@@ -561,7 +505,7 @@
     <w:semiHidden/>
     <w:unhideWhenUsed/>
     <w:qFormat/>
-    <w:rsid w:val="00190F51"/>
+    <w:rsid w:val="008A3965"/>
     <w:pPr>
       <w:keepNext/>
       <w:keepLines/>
@@ -572,7 +516,7 @@
       <w:rFonts w:eastAsiaTheme="majorEastAsia" w:cstheme="majorBidi"/>
       <w:i/>
       <w:iCs/>
-      <w:color w:val="0F4761" w:themeColor="accent1" w:themeShade="BF"/>
+      <w:color w:val="2F5496" w:themeColor="accent1" w:themeShade="BF"/>
     </w:rPr>
   </w:style>
   <w:style w:type="paragraph" w:styleId="Heading5">
@@ -584,7 +528,7 @@
     <w:semiHidden/>
     <w:unhideWhenUsed/>
     <w:qFormat/>
-    <w:rsid w:val="00190F51"/>
+    <w:rsid w:val="008A3965"/>
     <w:pPr>
       <w:keepNext/>
       <w:keepLines/>
@@ -593,7 +537,7 @@
     </w:pPr>
     <w:rPr>
       <w:rFonts w:eastAsiaTheme="majorEastAsia" w:cstheme="majorBidi"/>
-      <w:color w:val="0F4761" w:themeColor="accent1" w:themeShade="BF"/>
+      <w:color w:val="2F5496" w:themeColor="accent1" w:themeShade="BF"/>
     </w:rPr>
   </w:style>
   <w:style w:type="paragraph" w:styleId="Heading6">
@@ -605,7 +549,7 @@
     <w:semiHidden/>
     <w:unhideWhenUsed/>
     <w:qFormat/>
-    <w:rsid w:val="00190F51"/>
+    <w:rsid w:val="008A3965"/>
     <w:pPr>
       <w:keepNext/>
       <w:keepLines/>
@@ -628,7 +572,7 @@
     <w:semiHidden/>
     <w:unhideWhenUsed/>
     <w:qFormat/>
-    <w:rsid w:val="00190F51"/>
+    <w:rsid w:val="008A3965"/>
     <w:pPr>
       <w:keepNext/>
       <w:keepLines/>
@@ -649,7 +593,7 @@
     <w:semiHidden/>
     <w:unhideWhenUsed/>
     <w:qFormat/>
-    <w:rsid w:val="00190F51"/>
+    <w:rsid w:val="008A3965"/>
     <w:pPr>
       <w:keepNext/>
       <w:keepLines/>
@@ -672,7 +616,7 @@
     <w:semiHidden/>
     <w:unhideWhenUsed/>
     <w:qFormat/>
-    <w:rsid w:val="00190F51"/>
+    <w:rsid w:val="008A3965"/>
     <w:pPr>
       <w:keepNext/>
       <w:keepLines/>
@@ -716,10 +660,10 @@
     <w:basedOn w:val="DefaultParagraphFont"/>
     <w:link w:val="Heading1"/>
     <w:uiPriority w:val="9"/>
-    <w:rsid w:val="00190F51"/>
+    <w:rsid w:val="008A3965"/>
     <w:rPr>
       <w:rFonts w:asciiTheme="majorHAnsi" w:eastAsiaTheme="majorEastAsia" w:hAnsiTheme="majorHAnsi" w:cstheme="majorBidi"/>
-      <w:color w:val="0F4761" w:themeColor="accent1" w:themeShade="BF"/>
+      <w:color w:val="2F5496" w:themeColor="accent1" w:themeShade="BF"/>
       <w:sz w:val="40"/>
       <w:szCs w:val="40"/>
     </w:rPr>
@@ -730,10 +674,10 @@
     <w:link w:val="Heading2"/>
     <w:uiPriority w:val="9"/>
     <w:semiHidden/>
-    <w:rsid w:val="00190F51"/>
+    <w:rsid w:val="008A3965"/>
     <w:rPr>
       <w:rFonts w:asciiTheme="majorHAnsi" w:eastAsiaTheme="majorEastAsia" w:hAnsiTheme="majorHAnsi" w:cstheme="majorBidi"/>
-      <w:color w:val="0F4761" w:themeColor="accent1" w:themeShade="BF"/>
+      <w:color w:val="2F5496" w:themeColor="accent1" w:themeShade="BF"/>
       <w:sz w:val="32"/>
       <w:szCs w:val="32"/>
     </w:rPr>
@@ -744,10 +688,10 @@
     <w:link w:val="Heading3"/>
     <w:uiPriority w:val="9"/>
     <w:semiHidden/>
-    <w:rsid w:val="00190F51"/>
-    <w:rPr>
-      <w:rFonts w:eastAsiaTheme="majorEastAsia" w:cstheme="majorBidi"/>
-      <w:color w:val="0F4761" w:themeColor="accent1" w:themeShade="BF"/>
+    <w:rsid w:val="008A3965"/>
+    <w:rPr>
+      <w:rFonts w:eastAsiaTheme="majorEastAsia" w:cstheme="majorBidi"/>
+      <w:color w:val="2F5496" w:themeColor="accent1" w:themeShade="BF"/>
       <w:sz w:val="28"/>
       <w:szCs w:val="28"/>
     </w:rPr>
@@ -758,12 +702,12 @@
     <w:link w:val="Heading4"/>
     <w:uiPriority w:val="9"/>
     <w:semiHidden/>
-    <w:rsid w:val="00190F51"/>
+    <w:rsid w:val="008A3965"/>
     <w:rPr>
       <w:rFonts w:eastAsiaTheme="majorEastAsia" w:cstheme="majorBidi"/>
       <w:i/>
       <w:iCs/>
-      <w:color w:val="0F4761" w:themeColor="accent1" w:themeShade="BF"/>
+      <w:color w:val="2F5496" w:themeColor="accent1" w:themeShade="BF"/>
     </w:rPr>
   </w:style>
   <w:style w:type="character" w:customStyle="1" w:styleId="Heading5Char">
@@ -772,10 +716,10 @@
     <w:link w:val="Heading5"/>
     <w:uiPriority w:val="9"/>
     <w:semiHidden/>
-    <w:rsid w:val="00190F51"/>
-    <w:rPr>
-      <w:rFonts w:eastAsiaTheme="majorEastAsia" w:cstheme="majorBidi"/>
-      <w:color w:val="0F4761" w:themeColor="accent1" w:themeShade="BF"/>
+    <w:rsid w:val="008A3965"/>
+    <w:rPr>
+      <w:rFonts w:eastAsiaTheme="majorEastAsia" w:cstheme="majorBidi"/>
+      <w:color w:val="2F5496" w:themeColor="accent1" w:themeShade="BF"/>
     </w:rPr>
   </w:style>
   <w:style w:type="character" w:customStyle="1" w:styleId="Heading6Char">
@@ -784,7 +728,7 @@
     <w:link w:val="Heading6"/>
     <w:uiPriority w:val="9"/>
     <w:semiHidden/>
-    <w:rsid w:val="00190F51"/>
+    <w:rsid w:val="008A3965"/>
     <w:rPr>
       <w:rFonts w:eastAsiaTheme="majorEastAsia" w:cstheme="majorBidi"/>
       <w:i/>
@@ -798,7 +742,7 @@
     <w:link w:val="Heading7"/>
     <w:uiPriority w:val="9"/>
     <w:semiHidden/>
-    <w:rsid w:val="00190F51"/>
+    <w:rsid w:val="008A3965"/>
     <w:rPr>
       <w:rFonts w:eastAsiaTheme="majorEastAsia" w:cstheme="majorBidi"/>
       <w:color w:val="595959" w:themeColor="text1" w:themeTint="A6"/>
@@ -810,7 +754,7 @@
     <w:link w:val="Heading8"/>
     <w:uiPriority w:val="9"/>
     <w:semiHidden/>
-    <w:rsid w:val="00190F51"/>
+    <w:rsid w:val="008A3965"/>
     <w:rPr>
       <w:rFonts w:eastAsiaTheme="majorEastAsia" w:cstheme="majorBidi"/>
       <w:i/>
@@ -824,7 +768,7 @@
     <w:link w:val="Heading9"/>
     <w:uiPriority w:val="9"/>
     <w:semiHidden/>
-    <w:rsid w:val="00190F51"/>
+    <w:rsid w:val="008A3965"/>
     <w:rPr>
       <w:rFonts w:eastAsiaTheme="majorEastAsia" w:cstheme="majorBidi"/>
       <w:color w:val="272727" w:themeColor="text1" w:themeTint="D8"/>
@@ -837,7 +781,7 @@
     <w:link w:val="TitleChar"/>
     <w:uiPriority w:val="10"/>
     <w:qFormat/>
-    <w:rsid w:val="00190F51"/>
+    <w:rsid w:val="008A3965"/>
     <w:pPr>
       <w:spacing w:after="80" w:line="240" w:lineRule="auto"/>
       <w:contextualSpacing/>
@@ -855,7 +799,7 @@
     <w:basedOn w:val="DefaultParagraphFont"/>
     <w:link w:val="Title"/>
     <w:uiPriority w:val="10"/>
-    <w:rsid w:val="00190F51"/>
+    <w:rsid w:val="008A3965"/>
     <w:rPr>
       <w:rFonts w:asciiTheme="majorHAnsi" w:eastAsiaTheme="majorEastAsia" w:hAnsiTheme="majorHAnsi" w:cstheme="majorBidi"/>
       <w:spacing w:val="-10"/>
@@ -871,7 +815,7 @@
     <w:link w:val="SubtitleChar"/>
     <w:uiPriority w:val="11"/>
     <w:qFormat/>
-    <w:rsid w:val="00190F51"/>
+    <w:rsid w:val="008A3965"/>
     <w:pPr>
       <w:numPr>
         <w:ilvl w:val="1"/>
@@ -890,7 +834,7 @@
     <w:basedOn w:val="DefaultParagraphFont"/>
     <w:link w:val="Subtitle"/>
     <w:uiPriority w:val="11"/>
-    <w:rsid w:val="00190F51"/>
+    <w:rsid w:val="008A3965"/>
     <w:rPr>
       <w:rFonts w:eastAsiaTheme="majorEastAsia" w:cstheme="majorBidi"/>
       <w:color w:val="595959" w:themeColor="text1" w:themeTint="A6"/>
@@ -906,7 +850,7 @@
     <w:link w:val="QuoteChar"/>
     <w:uiPriority w:val="29"/>
     <w:qFormat/>
-    <w:rsid w:val="00190F51"/>
+    <w:rsid w:val="008A3965"/>
     <w:pPr>
       <w:spacing w:before="160"/>
       <w:jc w:val="center"/>
@@ -922,7 +866,7 @@
     <w:basedOn w:val="DefaultParagraphFont"/>
     <w:link w:val="Quote"/>
     <w:uiPriority w:val="29"/>
-    <w:rsid w:val="00190F51"/>
+    <w:rsid w:val="008A3965"/>
     <w:rPr>
       <w:i/>
       <w:iCs/>
@@ -934,7 +878,7 @@
     <w:basedOn w:val="Normal"/>
     <w:uiPriority w:val="34"/>
     <w:qFormat/>
-    <w:rsid w:val="00190F51"/>
+    <w:rsid w:val="008A3965"/>
     <w:pPr>
       <w:ind w:left="720"/>
       <w:contextualSpacing/>
@@ -945,11 +889,11 @@
     <w:basedOn w:val="DefaultParagraphFont"/>
     <w:uiPriority w:val="21"/>
     <w:qFormat/>
-    <w:rsid w:val="00190F51"/>
+    <w:rsid w:val="008A3965"/>
     <w:rPr>
       <w:i/>
       <w:iCs/>
-      <w:color w:val="0F4761" w:themeColor="accent1" w:themeShade="BF"/>
+      <w:color w:val="2F5496" w:themeColor="accent1" w:themeShade="BF"/>
     </w:rPr>
   </w:style>
   <w:style w:type="paragraph" w:styleId="IntenseQuote">
@@ -959,11 +903,11 @@
     <w:link w:val="IntenseQuoteChar"/>
     <w:uiPriority w:val="30"/>
     <w:qFormat/>
-    <w:rsid w:val="00190F51"/>
+    <w:rsid w:val="008A3965"/>
     <w:pPr>
       <w:pBdr>
-        <w:top w:val="single" w:sz="4" w:space="10" w:color="0F4761" w:themeColor="accent1" w:themeShade="BF"/>
-        <w:bottom w:val="single" w:sz="4" w:space="10" w:color="0F4761" w:themeColor="accent1" w:themeShade="BF"/>
+        <w:top w:val="single" w:sz="4" w:space="10" w:color="2F5496" w:themeColor="accent1" w:themeShade="BF"/>
+        <w:bottom w:val="single" w:sz="4" w:space="10" w:color="2F5496" w:themeColor="accent1" w:themeShade="BF"/>
       </w:pBdr>
       <w:spacing w:before="360" w:after="360"/>
       <w:ind w:left="864" w:right="864"/>
@@ -972,7 +916,7 @@
     <w:rPr>
       <w:i/>
       <w:iCs/>
-      <w:color w:val="0F4761" w:themeColor="accent1" w:themeShade="BF"/>
+      <w:color w:val="2F5496" w:themeColor="accent1" w:themeShade="BF"/>
     </w:rPr>
   </w:style>
   <w:style w:type="character" w:customStyle="1" w:styleId="IntenseQuoteChar">
@@ -980,11 +924,11 @@
     <w:basedOn w:val="DefaultParagraphFont"/>
     <w:link w:val="IntenseQuote"/>
     <w:uiPriority w:val="30"/>
-    <w:rsid w:val="00190F51"/>
+    <w:rsid w:val="008A3965"/>
     <w:rPr>
       <w:i/>
       <w:iCs/>
-      <w:color w:val="0F4761" w:themeColor="accent1" w:themeShade="BF"/>
+      <w:color w:val="2F5496" w:themeColor="accent1" w:themeShade="BF"/>
     </w:rPr>
   </w:style>
   <w:style w:type="character" w:styleId="IntenseReference">
@@ -992,12 +936,12 @@
     <w:basedOn w:val="DefaultParagraphFont"/>
     <w:uiPriority w:val="32"/>
     <w:qFormat/>
-    <w:rsid w:val="00190F51"/>
+    <w:rsid w:val="008A3965"/>
     <w:rPr>
       <w:b/>
       <w:bCs/>
       <w:smallCaps/>
-      <w:color w:val="0F4761" w:themeColor="accent1" w:themeShade="BF"/>
+      <w:color w:val="2F5496" w:themeColor="accent1" w:themeShade="BF"/>
       <w:spacing w:val="5"/>
     </w:rPr>
   </w:style>
@@ -1005,7 +949,7 @@
 </file>
 
 <file path=word/theme/theme1.xml><?xml version="1.0" encoding="utf-8"?>
-<a:theme xmlns:a="http://schemas.openxmlformats.org/drawingml/2006/main" name="Temă Office">
+<a:theme xmlns:a="http://schemas.openxmlformats.org/drawingml/2006/main" name="Office Theme">
   <a:themeElements>
     <a:clrScheme name="Office">
       <a:dk1>
@@ -1015,39 +959,39 @@
         <a:sysClr val="window" lastClr="FFFFFF"/>
       </a:lt1>
       <a:dk2>
-        <a:srgbClr val="0E2841"/>
+        <a:srgbClr val="44546A"/>
       </a:dk2>
       <a:lt2>
-        <a:srgbClr val="E8E8E8"/>
+        <a:srgbClr val="E7E6E6"/>
       </a:lt2>
       <a:accent1>
-        <a:srgbClr val="156082"/>
+        <a:srgbClr val="4472C4"/>
       </a:accent1>
       <a:accent2>
-        <a:srgbClr val="E97132"/>
+        <a:srgbClr val="ED7D31"/>
       </a:accent2>
       <a:accent3>
-        <a:srgbClr val="196B24"/>
+        <a:srgbClr val="A5A5A5"/>
       </a:accent3>
       <a:accent4>
-        <a:srgbClr val="0F9ED5"/>
+        <a:srgbClr val="FFC000"/>
       </a:accent4>
       <a:accent5>
-        <a:srgbClr val="A02B93"/>
+        <a:srgbClr val="5B9BD5"/>
       </a:accent5>
       <a:accent6>
-        <a:srgbClr val="4EA72E"/>
+        <a:srgbClr val="70AD47"/>
       </a:accent6>
       <a:hlink>
-        <a:srgbClr val="467886"/>
+        <a:srgbClr val="0563C1"/>
       </a:hlink>
       <a:folHlink>
-        <a:srgbClr val="96607D"/>
+        <a:srgbClr val="954F72"/>
       </a:folHlink>
     </a:clrScheme>
     <a:fontScheme name="Office">
       <a:majorFont>
-        <a:latin typeface="Aptos Display" panose="02110004020202020204"/>
+        <a:latin typeface="Calibri Light" panose="020F0302020204030204"/>
         <a:ea typeface=""/>
         <a:cs typeface=""/>
         <a:font script="Jpan" typeface="游ゴシック Light"/>
@@ -1099,10 +1043,10 @@
         <a:font script="Tfng" typeface="Ebrima"/>
       </a:majorFont>
       <a:minorFont>
-        <a:latin typeface="Aptos" panose="02110004020202020204"/>
+        <a:latin typeface="Calibri" panose="020F0502020204030204"/>
         <a:ea typeface=""/>
         <a:cs typeface=""/>
-        <a:font script="Jpan" typeface="游明朝"/>
+        <a:font script="Jpan" typeface="游ゴシック"/>
         <a:font script="Hang" typeface="맑은 고딕"/>
         <a:font script="Hans" typeface="等线"/>
         <a:font script="Hant" typeface="新細明體"/>
@@ -1293,7 +1237,7 @@
   <a:extraClrSchemeLst/>
   <a:extLst>
     <a:ext uri="{05A4C25C-085E-4340-85A3-A5531E510DB2}">
-      <thm15:themeFamily xmlns:thm15="http://schemas.microsoft.com/office/thememl/2012/main" name="Office Theme" id="{2E142A2C-CD16-42D6-873A-C26D2A0506FA}" vid="{1BDDFF52-6CD6-40A5-AB3C-68EB2F1E4D0A}"/>
+      <thm15:themeFamily xmlns:thm15="http://schemas.microsoft.com/office/thememl/2012/main" name="Office Theme" id="{62F939B6-93AF-4DB8-9C6B-D6C7DFDC589F}" vid="{4A3C46E8-61CC-4603-A589-7422A47A8E4A}"/>
     </a:ext>
   </a:extLst>
 </a:theme>

</xml_diff>